<commit_message>
Update academic CV from latest document
</commit_message>
<xml_diff>
--- a/assets/Yuyang_Zhang_CV.docx
+++ b/assets/Yuyang_Zhang_CV.docx
@@ -127,6 +127,7 @@
         <w:ind w:right="119"/>
         <w:jc w:val="left"/>
         <w:rPr>
+          <w:rFonts w:hint="eastAsia"/>
           <w:sz w:val="24"/>
           <w:szCs w:val="21"/>
         </w:rPr>
@@ -141,10 +142,18 @@
       </w:r>
       <w:r>
         <w:rPr>
+          <w:rFonts w:hint="eastAsia"/>
           <w:sz w:val="24"/>
           <w:szCs w:val="21"/>
         </w:rPr>
-        <w:t>9/2022 - 07/202</w:t>
+        <w:t>1</w:t>
+      </w:r>
+      <w:r>
+        <w:rPr>
+          <w:sz w:val="24"/>
+          <w:szCs w:val="21"/>
+        </w:rPr>
+        <w:t>/202</w:t>
       </w:r>
       <w:r>
         <w:rPr>
@@ -152,60 +161,105 @@
           <w:sz w:val="24"/>
           <w:szCs w:val="21"/>
         </w:rPr>
-        <w:t>5</w:t>
+        <w:t>7</w:t>
       </w:r>
       <w:r>
         <w:rPr>
           <w:sz w:val="24"/>
           <w:szCs w:val="21"/>
         </w:rPr>
+        <w:t xml:space="preserve"> - 0</w:t>
+      </w:r>
+      <w:r>
+        <w:rPr>
+          <w:rFonts w:hint="eastAsia"/>
+          <w:sz w:val="24"/>
+          <w:szCs w:val="21"/>
+        </w:rPr>
+        <w:t>1</w:t>
+      </w:r>
+      <w:r>
+        <w:rPr>
+          <w:sz w:val="24"/>
+          <w:szCs w:val="21"/>
+        </w:rPr>
+        <w:t>/20</w:t>
+      </w:r>
+      <w:r>
+        <w:rPr>
+          <w:rFonts w:hint="eastAsia"/>
+          <w:sz w:val="24"/>
+          <w:szCs w:val="21"/>
+        </w:rPr>
+        <w:t>31</w:t>
+      </w:r>
+      <w:r>
+        <w:rPr>
+          <w:sz w:val="24"/>
+          <w:szCs w:val="21"/>
+        </w:rPr>
         <w:tab/>
       </w:r>
       <w:r>
         <w:rPr>
+          <w:sz w:val="24"/>
+          <w:szCs w:val="21"/>
+        </w:rPr>
+        <w:t>Ph.D.</w:t>
+      </w:r>
+      <w:r>
+        <w:rPr>
           <w:rFonts w:hint="eastAsia"/>
           <w:sz w:val="24"/>
           <w:szCs w:val="21"/>
         </w:rPr>
-        <w:t>M</w:t>
+        <w:t xml:space="preserve"> in Mechanical Engineering </w:t>
       </w:r>
       <w:r>
         <w:rPr>
           <w:sz w:val="24"/>
           <w:szCs w:val="21"/>
         </w:rPr>
-        <w:t>.</w:t>
+        <w:tab/>
       </w:r>
       <w:r>
         <w:rPr>
           <w:rFonts w:hint="eastAsia"/>
+          <w:b/>
+          <w:bCs/>
           <w:sz w:val="24"/>
           <w:szCs w:val="21"/>
         </w:rPr>
-        <w:t>Eng</w:t>
-      </w:r>
-      <w:r>
-        <w:rPr>
+        <w:t>National Univer</w:t>
+      </w:r>
+      <w:r>
+        <w:rPr>
+          <w:rFonts w:hint="eastAsia"/>
+          <w:b/>
+          <w:bCs/>
           <w:sz w:val="24"/>
           <w:szCs w:val="21"/>
         </w:rPr>
-        <w:t>. in Material Science and Engineering</w:t>
-      </w:r>
-      <w:r>
-        <w:rPr>
+        <w:t>sity of Singapore</w:t>
+      </w:r>
+      <w:r>
+        <w:rPr>
+          <w:b/>
+          <w:bCs/>
           <w:sz w:val="24"/>
           <w:szCs w:val="21"/>
         </w:rPr>
-        <w:tab/>
-      </w:r>
-      <w:r>
-        <w:rPr>
+        <w:t xml:space="preserve">, </w:t>
+      </w:r>
+      <w:r>
+        <w:rPr>
+          <w:rFonts w:hint="eastAsia"/>
           <w:b/>
           <w:bCs/>
           <w:sz w:val="24"/>
           <w:szCs w:val="21"/>
         </w:rPr>
-        <w:t>University of Manchester, UK</w:t>
+        <w:t>SG</w:t>
       </w:r>
     </w:p>
     <w:p>
@@ -218,8 +272,6 @@
         <w:ind w:right="119"/>
         <w:jc w:val="left"/>
         <w:rPr>
-          <w:b/>
-          <w:bCs/>
           <w:sz w:val="24"/>
           <w:szCs w:val="21"/>
         </w:rPr>
@@ -237,6 +289,100 @@
           <w:sz w:val="24"/>
           <w:szCs w:val="21"/>
         </w:rPr>
+        <w:t>9/2022 - 07/202</w:t>
+      </w:r>
+      <w:r>
+        <w:rPr>
+          <w:rFonts w:hint="eastAsia"/>
+          <w:sz w:val="24"/>
+          <w:szCs w:val="21"/>
+        </w:rPr>
+        <w:t>5</w:t>
+      </w:r>
+      <w:r>
+        <w:rPr>
+          <w:sz w:val="24"/>
+          <w:szCs w:val="21"/>
+        </w:rPr>
+        <w:tab/>
+      </w:r>
+      <w:r>
+        <w:rPr>
+          <w:rFonts w:hint="eastAsia"/>
+          <w:sz w:val="24"/>
+          <w:szCs w:val="21"/>
+        </w:rPr>
+        <w:t>M</w:t>
+      </w:r>
+      <w:r>
+        <w:rPr>
+          <w:sz w:val="24"/>
+          <w:szCs w:val="21"/>
+        </w:rPr>
+        <w:t>.</w:t>
+      </w:r>
+      <w:r>
+        <w:rPr>
+          <w:rFonts w:hint="eastAsia"/>
+          <w:sz w:val="24"/>
+          <w:szCs w:val="21"/>
+        </w:rPr>
+        <w:t>Eng</w:t>
+      </w:r>
+      <w:r>
+        <w:rPr>
+          <w:sz w:val="24"/>
+          <w:szCs w:val="21"/>
+        </w:rPr>
+        <w:t>. in Material Science and Engineering</w:t>
+      </w:r>
+      <w:r>
+        <w:rPr>
+          <w:sz w:val="24"/>
+          <w:szCs w:val="21"/>
+        </w:rPr>
+        <w:tab/>
+      </w:r>
+      <w:r>
+        <w:rPr>
+          <w:b/>
+          <w:bCs/>
+          <w:sz w:val="24"/>
+          <w:szCs w:val="21"/>
+        </w:rPr>
+        <w:t>University of Manchester, UK</w:t>
+      </w:r>
+    </w:p>
+    <w:p>
+      <w:pPr>
+        <w:tabs>
+          <w:tab w:val="center" w:pos="4536"/>
+          <w:tab w:val="right" w:pos="10348"/>
+        </w:tabs>
+        <w:spacing w:before="120"/>
+        <w:ind w:right="119"/>
+        <w:jc w:val="left"/>
+        <w:rPr>
+          <w:rFonts w:hint="eastAsia"/>
+          <w:b/>
+          <w:bCs/>
+          <w:sz w:val="24"/>
+          <w:szCs w:val="21"/>
+        </w:rPr>
+      </w:pPr>
+      <w:r>
+        <w:rPr>
+          <w:rFonts w:hint="eastAsia"/>
+          <w:sz w:val="24"/>
+          <w:szCs w:val="21"/>
+        </w:rPr>
+        <w:t>0</w:t>
+      </w:r>
+      <w:r>
+        <w:rPr>
+          <w:sz w:val="24"/>
+          <w:szCs w:val="21"/>
+        </w:rPr>
         <w:t>9/2020 - 07/202</w:t>
       </w:r>
       <w:r>
@@ -285,7 +431,17 @@
           <w:sz w:val="24"/>
           <w:szCs w:val="21"/>
         </w:rPr>
-        <w:t xml:space="preserve"> University, China</w:t>
+        <w:t xml:space="preserve"> University, C</w:t>
+      </w:r>
+      <w:r>
+        <w:rPr>
+          <w:rFonts w:hint="eastAsia"/>
+          <w:b/>
+          <w:bCs/>
+          <w:sz w:val="24"/>
+          <w:szCs w:val="21"/>
+        </w:rPr>
+        <w:t>N</w:t>
       </w:r>
     </w:p>
     <w:p>
@@ -346,6 +502,58 @@
         <w:ind w:right="119"/>
         <w:jc w:val="left"/>
         <w:rPr>
+          <w:rFonts w:ascii="Segoe UI" w:hAnsi="Segoe UI" w:cs="Segoe UI" w:hint="eastAsia"/>
+          <w:sz w:val="22"/>
+          <w:szCs w:val="20"/>
+        </w:rPr>
+      </w:pPr>
+      <w:r>
+        <w:rPr>
+          <w:rFonts w:ascii="Segoe UI" w:hAnsi="Segoe UI" w:cs="Segoe UI" w:hint="eastAsia"/>
+          <w:sz w:val="22"/>
+          <w:szCs w:val="20"/>
+        </w:rPr>
+        <w:t xml:space="preserve">Multiscale </w:t>
+      </w:r>
+      <w:r>
+        <w:rPr>
+          <w:rFonts w:ascii="Segoe UI" w:hAnsi="Segoe UI" w:cs="Segoe UI" w:hint="eastAsia"/>
+          <w:sz w:val="22"/>
+          <w:szCs w:val="20"/>
+        </w:rPr>
+        <w:t>m</w:t>
+      </w:r>
+      <w:r>
+        <w:rPr>
+          <w:rFonts w:ascii="Segoe UI" w:hAnsi="Segoe UI" w:cs="Segoe UI" w:hint="eastAsia"/>
+          <w:sz w:val="22"/>
+          <w:szCs w:val="20"/>
+        </w:rPr>
+        <w:t>ultiphysics</w:t>
+      </w:r>
+      <w:r>
+        <w:rPr>
+          <w:rFonts w:ascii="Segoe UI" w:hAnsi="Segoe UI" w:cs="Segoe UI" w:hint="eastAsia"/>
+          <w:sz w:val="22"/>
+          <w:szCs w:val="20"/>
+        </w:rPr>
+        <w:t xml:space="preserve"> </w:t>
+      </w:r>
+      <w:r>
+        <w:rPr>
+          <w:rFonts w:ascii="Segoe UI" w:hAnsi="Segoe UI" w:cs="Segoe UI" w:hint="eastAsia"/>
+          <w:sz w:val="22"/>
+          <w:szCs w:val="20"/>
+        </w:rPr>
+        <w:t>Modelling</w:t>
+      </w:r>
+    </w:p>
+    <w:p>
+      <w:pPr>
+        <w:spacing w:before="120"/>
+        <w:ind w:right="119"/>
+        <w:jc w:val="left"/>
+        <w:rPr>
           <w:rFonts w:ascii="Segoe UI" w:hAnsi="Segoe UI" w:cs="Segoe UI"/>
           <w:sz w:val="22"/>
           <w:szCs w:val="20"/>
@@ -357,7 +565,7 @@
           <w:sz w:val="22"/>
           <w:szCs w:val="20"/>
         </w:rPr>
-        <w:t xml:space="preserve">Multiscale </w:t>
+        <w:t xml:space="preserve">AI enhanced </w:t>
       </w:r>
       <w:r>
         <w:rPr>
@@ -365,64 +573,8 @@
           <w:sz w:val="22"/>
           <w:szCs w:val="20"/>
         </w:rPr>
-        <w:t>m</w:t>
-      </w:r>
-      <w:r>
-        <w:rPr>
-          <w:rFonts w:ascii="Segoe UI" w:hAnsi="Segoe UI" w:cs="Segoe UI" w:hint="eastAsia"/>
-          <w:sz w:val="22"/>
-          <w:szCs w:val="20"/>
-        </w:rPr>
-        <w:t>ultiphysics</w:t>
-      </w:r>
-      <w:r>
-        <w:rPr>
-          <w:rFonts w:ascii="Segoe UI" w:hAnsi="Segoe UI" w:cs="Segoe UI" w:hint="eastAsia"/>
-          <w:sz w:val="22"/>
-          <w:szCs w:val="20"/>
-        </w:rPr>
-        <w:t xml:space="preserve"> material simulation</w:t>
-      </w:r>
-    </w:p>
-    <w:p>
-      <w:pPr>
-        <w:spacing w:before="120"/>
-        <w:ind w:right="119"/>
-        <w:jc w:val="left"/>
-        <w:rPr>
-          <w:rFonts w:ascii="Segoe UI" w:hAnsi="Segoe UI" w:cs="Segoe UI"/>
-          <w:sz w:val="22"/>
-          <w:szCs w:val="20"/>
-        </w:rPr>
-      </w:pPr>
-      <w:r>
-        <w:rPr>
-          <w:rFonts w:ascii="Segoe UI" w:hAnsi="Segoe UI" w:cs="Segoe UI" w:hint="eastAsia"/>
-          <w:sz w:val="22"/>
-          <w:szCs w:val="20"/>
-        </w:rPr>
-        <w:t xml:space="preserve">AI enhanced sensing and </w:t>
-      </w:r>
-      <w:r>
-        <w:rPr>
-          <w:rFonts w:ascii="Segoe UI" w:hAnsi="Segoe UI" w:cs="Segoe UI" w:hint="eastAsia"/>
-          <w:sz w:val="22"/>
-          <w:szCs w:val="20"/>
-        </w:rPr>
         <w:t>modelling</w:t>
       </w:r>
-    </w:p>
-    <w:p>
-      <w:pPr>
-        <w:spacing w:before="120"/>
-        <w:ind w:right="119"/>
-        <w:jc w:val="left"/>
-        <w:rPr>
-          <w:rFonts w:ascii="Segoe UI" w:hAnsi="Segoe UI" w:cs="Segoe UI"/>
-          <w:sz w:val="22"/>
-          <w:szCs w:val="20"/>
-        </w:rPr>
-      </w:pPr>
     </w:p>
     <w:p>
       <w:pPr>
@@ -723,55 +875,7 @@
           <w:rFonts w:ascii="Segoe UI" w:eastAsia="黑体" w:hAnsi="Segoe UI" w:cs="Segoe UI"/>
           <w:sz w:val="22"/>
         </w:rPr>
-        <w:t xml:space="preserve">Advisor: </w:t>
-      </w:r>
-      <w:proofErr w:type="spellStart"/>
-      <w:r>
-        <w:rPr>
-          <w:rFonts w:ascii="Segoe UI" w:eastAsia="黑体" w:hAnsi="Segoe UI" w:cs="Segoe UI"/>
-          <w:sz w:val="22"/>
-        </w:rPr>
-        <w:t>Jiajia</w:t>
-      </w:r>
-      <w:proofErr w:type="spellEnd"/>
-      <w:r>
-        <w:rPr>
-          <w:rFonts w:ascii="Segoe UI" w:eastAsia="黑体" w:hAnsi="Segoe UI" w:cs="Segoe UI"/>
-          <w:sz w:val="22"/>
-        </w:rPr>
-        <w:t xml:space="preserve"> Shao, Beijing Institute of </w:t>
-      </w:r>
-      <w:proofErr w:type="spellStart"/>
-      <w:r>
-        <w:rPr>
-          <w:rFonts w:ascii="Segoe UI" w:eastAsia="黑体" w:hAnsi="Segoe UI" w:cs="Segoe UI"/>
-          <w:sz w:val="22"/>
-        </w:rPr>
-        <w:t>Nanoenergy</w:t>
-      </w:r>
-      <w:proofErr w:type="spellEnd"/>
-      <w:r>
-        <w:rPr>
-          <w:rFonts w:ascii="Segoe UI" w:eastAsia="黑体" w:hAnsi="Segoe UI" w:cs="Segoe UI"/>
-          <w:sz w:val="22"/>
-        </w:rPr>
-        <w:t xml:space="preserve"> and </w:t>
-      </w:r>
-      <w:proofErr w:type="spellStart"/>
-      <w:r>
-        <w:rPr>
-          <w:rFonts w:ascii="Segoe UI" w:eastAsia="黑体" w:hAnsi="Segoe UI" w:cs="Segoe UI"/>
-          <w:sz w:val="22"/>
-        </w:rPr>
-        <w:t>Nanosystems</w:t>
-      </w:r>
-      <w:proofErr w:type="spellEnd"/>
-      <w:r>
-        <w:rPr>
-          <w:rFonts w:ascii="Segoe UI" w:eastAsia="黑体" w:hAnsi="Segoe UI" w:cs="Segoe UI"/>
-          <w:sz w:val="22"/>
-        </w:rPr>
-        <w:t xml:space="preserve"> (BINN).</w:t>
+        <w:t>Advisor: Jiajia Shao, Beijing Institute of Nanoenergy and Nanosystems (BINN).</w:t>
       </w:r>
     </w:p>
     <w:p>
@@ -854,25 +958,7 @@
           <w:sz w:val="20"/>
           <w:szCs w:val="18"/>
         </w:rPr>
-        <w:t xml:space="preserve">with </w:t>
-      </w:r>
-      <w:proofErr w:type="spellStart"/>
-      <w:r>
-        <w:rPr>
-          <w:rFonts w:ascii="Segoe UI" w:eastAsia="黑体" w:hAnsi="Segoe UI" w:cs="Segoe UI"/>
-          <w:sz w:val="20"/>
-          <w:szCs w:val="18"/>
-        </w:rPr>
-        <w:t>Zeyang</w:t>
-      </w:r>
-      <w:proofErr w:type="spellEnd"/>
-      <w:r>
-        <w:rPr>
-          <w:rFonts w:ascii="Segoe UI" w:eastAsia="黑体" w:hAnsi="Segoe UI" w:cs="Segoe UI"/>
-          <w:sz w:val="20"/>
-          <w:szCs w:val="18"/>
-        </w:rPr>
-        <w:t xml:space="preserve"> Yu. The model was later developed into an app and successfully deployed as a website backend.</w:t>
+        <w:t>with Zeyang Yu. The model was later developed into an app and successfully deployed as a website backend.</w:t>
       </w:r>
     </w:p>
     <w:p>
@@ -970,43 +1056,7 @@
           <w:sz w:val="22"/>
           <w:szCs w:val="20"/>
         </w:rPr>
-        <w:t xml:space="preserve">Advisor: Di Wei, Beijing Institute of </w:t>
-      </w:r>
-      <w:proofErr w:type="spellStart"/>
-      <w:r>
-        <w:rPr>
-          <w:rFonts w:ascii="Segoe UI" w:eastAsia="黑体" w:hAnsi="Segoe UI" w:cs="Segoe UI"/>
-          <w:sz w:val="22"/>
-          <w:szCs w:val="20"/>
-        </w:rPr>
-        <w:t>Nanoenergy</w:t>
-      </w:r>
-      <w:proofErr w:type="spellEnd"/>
-      <w:r>
-        <w:rPr>
-          <w:rFonts w:ascii="Segoe UI" w:eastAsia="黑体" w:hAnsi="Segoe UI" w:cs="Segoe UI"/>
-          <w:sz w:val="22"/>
-          <w:szCs w:val="20"/>
-        </w:rPr>
-        <w:t xml:space="preserve"> and </w:t>
-      </w:r>
-      <w:proofErr w:type="spellStart"/>
-      <w:r>
-        <w:rPr>
-          <w:rFonts w:ascii="Segoe UI" w:eastAsia="黑体" w:hAnsi="Segoe UI" w:cs="Segoe UI"/>
-          <w:sz w:val="22"/>
-          <w:szCs w:val="20"/>
-        </w:rPr>
-        <w:t>Nanosystems</w:t>
-      </w:r>
-      <w:proofErr w:type="spellEnd"/>
-      <w:r>
-        <w:rPr>
-          <w:rFonts w:ascii="Segoe UI" w:eastAsia="黑体" w:hAnsi="Segoe UI" w:cs="Segoe UI"/>
-          <w:sz w:val="22"/>
-          <w:szCs w:val="20"/>
-        </w:rPr>
-        <w:t xml:space="preserve"> (BINN).</w:t>
+        <w:t>Advisor: Di Wei, Beijing Institute of Nanoenergy and Nanosystems (BINN).</w:t>
       </w:r>
     </w:p>
     <w:p>
@@ -1231,25 +1281,7 @@
           <w:sz w:val="20"/>
           <w:szCs w:val="18"/>
         </w:rPr>
-        <w:t xml:space="preserve">Built a spore monitoring sensor prototype using Raspberry Pi and </w:t>
-      </w:r>
-      <w:proofErr w:type="spellStart"/>
-      <w:r>
-        <w:rPr>
-          <w:rFonts w:ascii="Segoe UI" w:eastAsia="黑体" w:hAnsi="Segoe UI" w:cs="Segoe UI"/>
-          <w:sz w:val="20"/>
-          <w:szCs w:val="18"/>
-        </w:rPr>
-        <w:t>Arducam</w:t>
-      </w:r>
-      <w:proofErr w:type="spellEnd"/>
-      <w:r>
-        <w:rPr>
-          <w:rFonts w:ascii="Segoe UI" w:eastAsia="黑体" w:hAnsi="Segoe UI" w:cs="Segoe UI"/>
-          <w:sz w:val="20"/>
-          <w:szCs w:val="18"/>
-        </w:rPr>
-        <w:t xml:space="preserve"> camera. Developed machine learning models trained with artificially incubated spore images to support sensor-based detection. </w:t>
+        <w:t xml:space="preserve">Built a spore monitoring sensor prototype using Raspberry Pi and Arducam camera. Developed machine learning models trained with artificially incubated spore images to support sensor-based detection. </w:t>
       </w:r>
       <w:r>
         <w:rPr>
@@ -1970,43 +2002,7 @@
           <w:sz w:val="20"/>
           <w:szCs w:val="18"/>
         </w:rPr>
-        <w:t xml:space="preserve">, Wang, Z. L., &amp; Wei, D. (2025). Mechano‐Driven </w:t>
-      </w:r>
-      <w:proofErr w:type="spellStart"/>
-      <w:r>
-        <w:rPr>
-          <w:rFonts w:ascii="Segoe UI" w:eastAsia="黑体" w:hAnsi="Segoe UI" w:cs="Segoe UI"/>
-          <w:sz w:val="20"/>
-          <w:szCs w:val="18"/>
-        </w:rPr>
-        <w:t>Neuromimetic</w:t>
-      </w:r>
-      <w:proofErr w:type="spellEnd"/>
-      <w:r>
-        <w:rPr>
-          <w:rFonts w:ascii="Segoe UI" w:eastAsia="黑体" w:hAnsi="Segoe UI" w:cs="Segoe UI"/>
-          <w:sz w:val="20"/>
-          <w:szCs w:val="18"/>
-        </w:rPr>
-        <w:t xml:space="preserve"> Logic Gates Established by Geometrically Asymmetric Hydrogel </w:t>
-      </w:r>
-      <w:proofErr w:type="spellStart"/>
-      <w:r>
-        <w:rPr>
-          <w:rFonts w:ascii="Segoe UI" w:eastAsia="黑体" w:hAnsi="Segoe UI" w:cs="Segoe UI"/>
-          <w:sz w:val="20"/>
-          <w:szCs w:val="18"/>
-        </w:rPr>
-        <w:t>Iontronics</w:t>
-      </w:r>
-      <w:proofErr w:type="spellEnd"/>
-      <w:r>
-        <w:rPr>
-          <w:rFonts w:ascii="Segoe UI" w:eastAsia="黑体" w:hAnsi="Segoe UI" w:cs="Segoe UI"/>
-          <w:sz w:val="20"/>
-          <w:szCs w:val="18"/>
-        </w:rPr>
-        <w:t>. </w:t>
+        <w:t>, Wang, Z. L., &amp; Wei, D. (2025). Mechano‐Driven Neuromimetic Logic Gates Established by Geometrically Asymmetric Hydrogel Iontronics. </w:t>
       </w:r>
       <w:r>
         <w:rPr>
@@ -2016,51 +2012,7 @@
           <w:sz w:val="20"/>
           <w:szCs w:val="18"/>
         </w:rPr>
-        <w:t xml:space="preserve">Small (Weinheim </w:t>
-      </w:r>
-      <w:proofErr w:type="gramStart"/>
-      <w:r>
-        <w:rPr>
-          <w:rFonts w:ascii="Segoe UI" w:eastAsia="黑体" w:hAnsi="Segoe UI" w:cs="Segoe UI"/>
-          <w:i/>
-          <w:iCs/>
-          <w:sz w:val="20"/>
-          <w:szCs w:val="18"/>
-        </w:rPr>
-        <w:t>an</w:t>
-      </w:r>
-      <w:proofErr w:type="gramEnd"/>
-      <w:r>
-        <w:rPr>
-          <w:rFonts w:ascii="Segoe UI" w:eastAsia="黑体" w:hAnsi="Segoe UI" w:cs="Segoe UI"/>
-          <w:i/>
-          <w:iCs/>
-          <w:sz w:val="20"/>
-          <w:szCs w:val="18"/>
-        </w:rPr>
-        <w:t xml:space="preserve"> Der </w:t>
-      </w:r>
-      <w:proofErr w:type="spellStart"/>
-      <w:r>
-        <w:rPr>
-          <w:rFonts w:ascii="Segoe UI" w:eastAsia="黑体" w:hAnsi="Segoe UI" w:cs="Segoe UI"/>
-          <w:i/>
-          <w:iCs/>
-          <w:sz w:val="20"/>
-          <w:szCs w:val="18"/>
-        </w:rPr>
-        <w:t>Bergstrasse</w:t>
-      </w:r>
-      <w:proofErr w:type="spellEnd"/>
-      <w:r>
-        <w:rPr>
-          <w:rFonts w:ascii="Segoe UI" w:eastAsia="黑体" w:hAnsi="Segoe UI" w:cs="Segoe UI"/>
-          <w:i/>
-          <w:iCs/>
-          <w:sz w:val="20"/>
-          <w:szCs w:val="18"/>
-        </w:rPr>
-        <w:t>, Germany)</w:t>
+        <w:t>Small (Weinheim an Der Bergstrasse, Germany)</w:t>
       </w:r>
       <w:r>
         <w:rPr>
@@ -2141,25 +2093,7 @@
           <w:sz w:val="20"/>
           <w:szCs w:val="18"/>
         </w:rPr>
-        <w:t xml:space="preserve">, Li, X., Zhou, Y., Wang, Z. L., &amp; Wei, D. (2026). Mechanically Driven, Self-Powered Hydrogel </w:t>
-      </w:r>
-      <w:proofErr w:type="spellStart"/>
-      <w:r>
-        <w:rPr>
-          <w:rFonts w:ascii="Segoe UI" w:eastAsia="黑体" w:hAnsi="Segoe UI" w:cs="Segoe UI"/>
-          <w:sz w:val="20"/>
-          <w:szCs w:val="18"/>
-        </w:rPr>
-        <w:t>Iontronics</w:t>
-      </w:r>
-      <w:proofErr w:type="spellEnd"/>
-      <w:r>
-        <w:rPr>
-          <w:rFonts w:ascii="Segoe UI" w:eastAsia="黑体" w:hAnsi="Segoe UI" w:cs="Segoe UI"/>
-          <w:sz w:val="20"/>
-          <w:szCs w:val="18"/>
-        </w:rPr>
-        <w:t xml:space="preserve"> for Visualized Tactile Logic Gate Circuit. </w:t>
+        <w:t xml:space="preserve">, Li, X., Zhou, Y., Wang, Z. L., &amp; Wei, D. (2026). Mechanically Driven, Self-Powered Hydrogel Iontronics for Visualized Tactile Logic Gate Circuit. </w:t>
       </w:r>
       <w:r>
         <w:rPr>
@@ -2177,43 +2111,7 @@
           <w:sz w:val="20"/>
           <w:szCs w:val="18"/>
         </w:rPr>
-        <w:t xml:space="preserve"> (Weinheim </w:t>
-      </w:r>
-      <w:proofErr w:type="gramStart"/>
-      <w:r>
-        <w:rPr>
-          <w:rFonts w:ascii="Segoe UI" w:eastAsia="黑体" w:hAnsi="Segoe UI" w:cs="Segoe UI"/>
-          <w:sz w:val="20"/>
-          <w:szCs w:val="18"/>
-        </w:rPr>
-        <w:t>an</w:t>
-      </w:r>
-      <w:proofErr w:type="gramEnd"/>
-      <w:r>
-        <w:rPr>
-          <w:rFonts w:ascii="Segoe UI" w:eastAsia="黑体" w:hAnsi="Segoe UI" w:cs="Segoe UI"/>
-          <w:sz w:val="20"/>
-          <w:szCs w:val="18"/>
-        </w:rPr>
-        <w:t xml:space="preserve"> Der </w:t>
-      </w:r>
-      <w:proofErr w:type="spellStart"/>
-      <w:r>
-        <w:rPr>
-          <w:rFonts w:ascii="Segoe UI" w:eastAsia="黑体" w:hAnsi="Segoe UI" w:cs="Segoe UI"/>
-          <w:sz w:val="20"/>
-          <w:szCs w:val="18"/>
-        </w:rPr>
-        <w:t>Bergstrasse</w:t>
-      </w:r>
-      <w:proofErr w:type="spellEnd"/>
-      <w:r>
-        <w:rPr>
-          <w:rFonts w:ascii="Segoe UI" w:eastAsia="黑体" w:hAnsi="Segoe UI" w:cs="Segoe UI"/>
-          <w:sz w:val="20"/>
-          <w:szCs w:val="18"/>
-        </w:rPr>
-        <w:t xml:space="preserve">, Germany). </w:t>
+        <w:t xml:space="preserve"> (Weinheim an Der Bergstrasse, Germany). </w:t>
       </w:r>
       <w:r>
         <w:rPr>
@@ -2634,6 +2532,122 @@
           <w:bCs/>
         </w:rPr>
         <w:t>ce</w:t>
+      </w:r>
+    </w:p>
+    <w:p>
+      <w:pPr>
+        <w:pStyle w:val="a5"/>
+        <w:numPr>
+          <w:ilvl w:val="0"/>
+          <w:numId w:val="27"/>
+        </w:numPr>
+        <w:tabs>
+          <w:tab w:val="left" w:pos="9356"/>
+        </w:tabs>
+        <w:spacing w:before="120" w:after="120"/>
+        <w:ind w:left="283" w:firstLineChars="0" w:hanging="215"/>
+        <w:jc w:val="left"/>
+        <w:rPr>
+          <w:b/>
+          <w:bCs/>
+        </w:rPr>
+      </w:pPr>
+      <w:r>
+        <w:rPr>
+          <w:rFonts w:hint="eastAsia"/>
+          <w:b/>
+          <w:bCs/>
+        </w:rPr>
+        <w:t xml:space="preserve">Research </w:t>
+      </w:r>
+      <w:r>
+        <w:rPr>
+          <w:b/>
+          <w:bCs/>
+        </w:rPr>
+        <w:t>assistant</w:t>
+      </w:r>
+      <w:r>
+        <w:rPr>
+          <w:rFonts w:hint="eastAsia"/>
+          <w:b/>
+          <w:bCs/>
+        </w:rPr>
+        <w:t xml:space="preserve"> at </w:t>
+      </w:r>
+      <w:r>
+        <w:rPr>
+          <w:rFonts w:hint="eastAsia"/>
+          <w:b/>
+          <w:bCs/>
+        </w:rPr>
+        <w:t xml:space="preserve">National University of Singapore               </w:t>
+      </w:r>
+      <w:r>
+        <w:rPr>
+          <w:rFonts w:hint="eastAsia"/>
+        </w:rPr>
+        <w:t>2026.</w:t>
+      </w:r>
+      <w:r>
+        <w:rPr>
+          <w:rFonts w:hint="eastAsia"/>
+        </w:rPr>
+        <w:t>9-2027.1</w:t>
+      </w:r>
+    </w:p>
+    <w:p>
+      <w:pPr>
+        <w:ind w:left="284" w:firstLine="141"/>
+        <w:rPr>
+          <w:rFonts w:ascii="Segoe UI" w:eastAsia="黑体" w:hAnsi="Segoe UI" w:cs="Segoe UI" w:hint="eastAsia"/>
+          <w:sz w:val="20"/>
+          <w:szCs w:val="18"/>
+        </w:rPr>
+      </w:pPr>
+      <w:r>
+        <w:rPr>
+          <w:rFonts w:ascii="Segoe UI" w:eastAsia="黑体" w:hAnsi="Segoe UI" w:cs="Segoe UI" w:hint="eastAsia"/>
+          <w:bCs/>
+          <w:sz w:val="24"/>
+          <w:szCs w:val="24"/>
+        </w:rPr>
+        <w:t>Advisor:</w:t>
+      </w:r>
+      <w:r>
+        <w:rPr>
+          <w:rFonts w:ascii="Segoe UI" w:eastAsia="黑体" w:hAnsi="Segoe UI" w:cs="Segoe UI"/>
+          <w:sz w:val="22"/>
+        </w:rPr>
+        <w:t xml:space="preserve"> </w:t>
+      </w:r>
+      <w:r>
+        <w:rPr>
+          <w:rFonts w:ascii="Segoe UI" w:eastAsia="黑体" w:hAnsi="Segoe UI" w:cs="Segoe UI" w:hint="eastAsia"/>
+          <w:sz w:val="22"/>
+        </w:rPr>
+        <w:t>James Utama Surjadi</w:t>
+      </w:r>
+      <w:r>
+        <w:rPr>
+          <w:rFonts w:ascii="Segoe UI" w:eastAsia="黑体" w:hAnsi="Segoe UI" w:cs="Segoe UI" w:hint="eastAsia"/>
+          <w:sz w:val="22"/>
+        </w:rPr>
+        <w:t xml:space="preserve">, National </w:t>
+      </w:r>
+      <w:r>
+        <w:rPr>
+          <w:rFonts w:ascii="Segoe UI" w:eastAsia="黑体" w:hAnsi="Segoe UI" w:cs="Segoe UI"/>
+          <w:sz w:val="22"/>
+        </w:rPr>
+        <w:t>University</w:t>
+      </w:r>
+      <w:r>
+        <w:rPr>
+          <w:rFonts w:ascii="Segoe UI" w:eastAsia="黑体" w:hAnsi="Segoe UI" w:cs="Segoe UI" w:hint="eastAsia"/>
+          <w:sz w:val="22"/>
+        </w:rPr>
+        <w:t xml:space="preserve"> of Singapore</w:t>
       </w:r>
     </w:p>
     <w:p>
@@ -2682,31 +2696,7 @@
           <w:b/>
           <w:bCs/>
         </w:rPr>
-        <w:t xml:space="preserve">Beijing Institute of </w:t>
-      </w:r>
-      <w:proofErr w:type="spellStart"/>
-      <w:r>
-        <w:rPr>
-          <w:b/>
-          <w:bCs/>
-        </w:rPr>
-        <w:t>Nanoenergy</w:t>
-      </w:r>
-      <w:proofErr w:type="spellEnd"/>
-      <w:r>
-        <w:rPr>
-          <w:b/>
-          <w:bCs/>
-        </w:rPr>
-        <w:t xml:space="preserve"> and </w:t>
-      </w:r>
-      <w:proofErr w:type="spellStart"/>
-      <w:r>
-        <w:rPr>
-          <w:b/>
-          <w:bCs/>
-        </w:rPr>
-        <w:t>Nanosystem</w:t>
+        <w:t>Beijing Institute of Nanoenergy and Nanosystem</w:t>
       </w:r>
       <w:r>
         <w:rPr>
@@ -2714,16 +2704,7 @@
           <w:b/>
           <w:bCs/>
         </w:rPr>
-        <w:t>s</w:t>
-      </w:r>
-      <w:proofErr w:type="spellEnd"/>
-      <w:r>
-        <w:rPr>
-          <w:rFonts w:hint="eastAsia"/>
-          <w:b/>
-          <w:bCs/>
-        </w:rPr>
-        <w:t xml:space="preserve"> </w:t>
+        <w:t xml:space="preserve">s </w:t>
       </w:r>
       <w:r>
         <w:rPr>
@@ -2801,39 +2782,7 @@
           <w:rFonts w:ascii="Segoe UI" w:eastAsia="黑体" w:hAnsi="Segoe UI" w:cs="Segoe UI"/>
           <w:sz w:val="22"/>
         </w:rPr>
-        <w:t xml:space="preserve">, Beijing Institute of </w:t>
-      </w:r>
-      <w:proofErr w:type="spellStart"/>
-      <w:r>
-        <w:rPr>
-          <w:rFonts w:ascii="Segoe UI" w:eastAsia="黑体" w:hAnsi="Segoe UI" w:cs="Segoe UI"/>
-          <w:sz w:val="22"/>
-        </w:rPr>
-        <w:t>Nanoenergy</w:t>
-      </w:r>
-      <w:proofErr w:type="spellEnd"/>
-      <w:r>
-        <w:rPr>
-          <w:rFonts w:ascii="Segoe UI" w:eastAsia="黑体" w:hAnsi="Segoe UI" w:cs="Segoe UI"/>
-          <w:sz w:val="22"/>
-        </w:rPr>
-        <w:t xml:space="preserve"> and </w:t>
-      </w:r>
-      <w:proofErr w:type="spellStart"/>
-      <w:r>
-        <w:rPr>
-          <w:rFonts w:ascii="Segoe UI" w:eastAsia="黑体" w:hAnsi="Segoe UI" w:cs="Segoe UI"/>
-          <w:sz w:val="22"/>
-        </w:rPr>
-        <w:t>Nanosystems</w:t>
-      </w:r>
-      <w:proofErr w:type="spellEnd"/>
-      <w:r>
-        <w:rPr>
-          <w:rFonts w:ascii="Segoe UI" w:eastAsia="黑体" w:hAnsi="Segoe UI" w:cs="Segoe UI"/>
-          <w:sz w:val="22"/>
-        </w:rPr>
-        <w:t xml:space="preserve"> (BINN)</w:t>
+        <w:t>, Beijing Institute of Nanoenergy and Nanosystems (BINN)</w:t>
       </w:r>
     </w:p>
     <w:p>
@@ -2882,31 +2831,7 @@
           <w:b/>
           <w:bCs/>
         </w:rPr>
-        <w:t xml:space="preserve">Beijing Institute of </w:t>
-      </w:r>
-      <w:proofErr w:type="spellStart"/>
-      <w:r>
-        <w:rPr>
-          <w:b/>
-          <w:bCs/>
-        </w:rPr>
-        <w:t>Nanoenergy</w:t>
-      </w:r>
-      <w:proofErr w:type="spellEnd"/>
-      <w:r>
-        <w:rPr>
-          <w:b/>
-          <w:bCs/>
-        </w:rPr>
-        <w:t xml:space="preserve"> and </w:t>
-      </w:r>
-      <w:proofErr w:type="spellStart"/>
-      <w:r>
-        <w:rPr>
-          <w:b/>
-          <w:bCs/>
-        </w:rPr>
-        <w:t>Nanosystem</w:t>
+        <w:t>Beijing Institute of Nanoenergy and Nanosystem</w:t>
       </w:r>
       <w:r>
         <w:rPr>
@@ -2916,7 +2841,6 @@
         </w:rPr>
         <w:t>s</w:t>
       </w:r>
-      <w:proofErr w:type="spellEnd"/>
       <w:r>
         <w:rPr>
           <w:rFonts w:hint="eastAsia"/>
@@ -2989,61 +2913,20 @@
         </w:rPr>
         <w:t xml:space="preserve"> </w:t>
       </w:r>
-      <w:proofErr w:type="spellStart"/>
       <w:r>
         <w:rPr>
           <w:rFonts w:ascii="Segoe UI" w:eastAsia="黑体" w:hAnsi="Segoe UI" w:cs="Segoe UI"/>
           <w:sz w:val="22"/>
         </w:rPr>
-        <w:t>Jiajia</w:t>
-      </w:r>
-      <w:proofErr w:type="spellEnd"/>
+        <w:t xml:space="preserve">Jiajia Shao, </w:t>
+      </w:r>
+      <w:bookmarkStart w:id="0" w:name="_Hlk212208611"/>
       <w:r>
         <w:rPr>
           <w:rFonts w:ascii="Segoe UI" w:eastAsia="黑体" w:hAnsi="Segoe UI" w:cs="Segoe UI"/>
           <w:sz w:val="22"/>
         </w:rPr>
-        <w:t xml:space="preserve"> Shao, </w:t>
-      </w:r>
-      <w:bookmarkStart w:id="0" w:name="_Hlk212208611"/>
-      <w:r>
-        <w:rPr>
-          <w:rFonts w:ascii="Segoe UI" w:eastAsia="黑体" w:hAnsi="Segoe UI" w:cs="Segoe UI"/>
-          <w:sz w:val="22"/>
-        </w:rPr>
-        <w:t xml:space="preserve">Beijing Institute of </w:t>
-      </w:r>
-      <w:proofErr w:type="spellStart"/>
-      <w:r>
-        <w:rPr>
-          <w:rFonts w:ascii="Segoe UI" w:eastAsia="黑体" w:hAnsi="Segoe UI" w:cs="Segoe UI"/>
-          <w:sz w:val="22"/>
-        </w:rPr>
-        <w:t>Nanoenergy</w:t>
-      </w:r>
-      <w:proofErr w:type="spellEnd"/>
-      <w:r>
-        <w:rPr>
-          <w:rFonts w:ascii="Segoe UI" w:eastAsia="黑体" w:hAnsi="Segoe UI" w:cs="Segoe UI"/>
-          <w:sz w:val="22"/>
-        </w:rPr>
-        <w:t xml:space="preserve"> and </w:t>
-      </w:r>
-      <w:proofErr w:type="spellStart"/>
-      <w:r>
-        <w:rPr>
-          <w:rFonts w:ascii="Segoe UI" w:eastAsia="黑体" w:hAnsi="Segoe UI" w:cs="Segoe UI"/>
-          <w:sz w:val="22"/>
-        </w:rPr>
-        <w:t>Nanosystems</w:t>
-      </w:r>
-      <w:proofErr w:type="spellEnd"/>
-      <w:r>
-        <w:rPr>
-          <w:rFonts w:ascii="Segoe UI" w:eastAsia="黑体" w:hAnsi="Segoe UI" w:cs="Segoe UI"/>
-          <w:sz w:val="22"/>
-        </w:rPr>
-        <w:t xml:space="preserve"> </w:t>
+        <w:t xml:space="preserve">Beijing Institute of Nanoenergy and Nanosystems </w:t>
       </w:r>
       <w:bookmarkEnd w:id="0"/>
       <w:r>
@@ -3440,6 +3323,7 @@
           <w:sz w:val="24"/>
           <w:szCs w:val="21"/>
         </w:rPr>
+        <w:lastRenderedPageBreak/>
         <w:t>Data Analysis &amp; Visualization</w:t>
       </w:r>
       <w:r>

</xml_diff>